<commit_message>
Kinézet javítás + pár elem hozzáadva
</commit_message>
<xml_diff>
--- a/VizsgaRemekDokumentacio(A).docx
+++ b/VizsgaRemekDokumentacio(A).docx
@@ -1,6 +1,6 @@
 
 <file path=word/document.xml><?xml version="1.0" encoding="utf-8"?>
-<w:document xmlns:wpc="http://schemas.microsoft.com/office/word/2010/wordprocessingCanvas" xmlns:cx="http://schemas.microsoft.com/office/drawing/2014/chartex" xmlns:cx1="http://schemas.microsoft.com/office/drawing/2015/9/8/chartex" xmlns:cx2="http://schemas.microsoft.com/office/drawing/2015/10/21/chartex" xmlns:cx3="http://schemas.microsoft.com/office/drawing/2016/5/9/chartex" xmlns:cx4="http://schemas.microsoft.com/office/drawing/2016/5/10/chartex" xmlns:cx5="http://schemas.microsoft.com/office/drawing/2016/5/11/chartex" xmlns:cx6="http://schemas.microsoft.com/office/drawing/2016/5/12/chartex" xmlns:cx7="http://schemas.microsoft.com/office/drawing/2016/5/13/chartex" xmlns:cx8="http://schemas.microsoft.com/office/drawing/2016/5/14/chartex" xmlns:mc="http://schemas.openxmlformats.org/markup-compatibility/2006" xmlns:aink="http://schemas.microsoft.com/office/drawing/2016/ink" xmlns:am3d="http://schemas.microsoft.com/office/drawing/2017/model3d" xmlns:o="urn:schemas-microsoft-com:office:office" xmlns:oel="http://schemas.microsoft.com/office/2019/extlst" xmlns:r="http://schemas.openxmlformats.org/officeDocument/2006/relationships" xmlns:m="http://schemas.openxmlformats.org/officeDocument/2006/math" xmlns:v="urn:schemas-microsoft-com:vml" xmlns:wp14="http://schemas.microsoft.com/office/word/2010/wordprocessingDrawing" xmlns:wp="http://schemas.openxmlformats.org/drawingml/2006/wordprocessingDrawing" xmlns:w10="urn:schemas-microsoft-com:office:word" xmlns:w="http://schemas.openxmlformats.org/wordprocessingml/2006/main" xmlns:w14="http://schemas.microsoft.com/office/word/2010/wordml" xmlns:w15="http://schemas.microsoft.com/office/word/2012/wordml" xmlns:w16cex="http://schemas.microsoft.com/office/word/2018/wordml/cex" xmlns:w16cid="http://schemas.microsoft.com/office/word/2016/wordml/cid" xmlns:w16="http://schemas.microsoft.com/office/word/2018/wordml" xmlns:w16du="http://schemas.microsoft.com/office/word/2023/wordml/word16du" xmlns:w16sdtdh="http://schemas.microsoft.com/office/word/2020/wordml/sdtdatahash" xmlns:w16sdtfl="http://schemas.microsoft.com/office/word/2024/wordml/sdtformatlock" xmlns:w16se="http://schemas.microsoft.com/office/word/2015/wordml/symex" xmlns:wpg="http://schemas.microsoft.com/office/word/2010/wordprocessingGroup" xmlns:wpi="http://schemas.microsoft.com/office/word/2010/wordprocessingInk" xmlns:wne="http://schemas.microsoft.com/office/word/2006/wordml" xmlns:wps="http://schemas.microsoft.com/office/word/2010/wordprocessingShape" mc:Ignorable="w14 w15 w16se w16cid w16 w16cex w16sdtdh w16sdtfl w16du wp14">
+<w:document xmlns:wpc="http://schemas.microsoft.com/office/word/2010/wordprocessingCanvas" xmlns:cx="http://schemas.microsoft.com/office/drawing/2014/chartex" xmlns:cx1="http://schemas.microsoft.com/office/drawing/2015/9/8/chartex" xmlns:cx2="http://schemas.microsoft.com/office/drawing/2015/10/21/chartex" xmlns:cx3="http://schemas.microsoft.com/office/drawing/2016/5/9/chartex" xmlns:cx4="http://schemas.microsoft.com/office/drawing/2016/5/10/chartex" xmlns:cx5="http://schemas.microsoft.com/office/drawing/2016/5/11/chartex" xmlns:cx6="http://schemas.microsoft.com/office/drawing/2016/5/12/chartex" xmlns:cx7="http://schemas.microsoft.com/office/drawing/2016/5/13/chartex" xmlns:cx8="http://schemas.microsoft.com/office/drawing/2016/5/14/chartex" xmlns:mc="http://schemas.openxmlformats.org/markup-compatibility/2006" xmlns:aink="http://schemas.microsoft.com/office/drawing/2016/ink" xmlns:am3d="http://schemas.microsoft.com/office/drawing/2017/model3d" xmlns:o="urn:schemas-microsoft-com:office:office" xmlns:r="http://schemas.openxmlformats.org/officeDocument/2006/relationships" xmlns:m="http://schemas.openxmlformats.org/officeDocument/2006/math" xmlns:v="urn:schemas-microsoft-com:vml" xmlns:wp14="http://schemas.microsoft.com/office/word/2010/wordprocessingDrawing" xmlns:wp="http://schemas.openxmlformats.org/drawingml/2006/wordprocessingDrawing" xmlns:w10="urn:schemas-microsoft-com:office:word" xmlns:w="http://schemas.openxmlformats.org/wordprocessingml/2006/main" xmlns:w14="http://schemas.microsoft.com/office/word/2010/wordml" xmlns:w15="http://schemas.microsoft.com/office/word/2012/wordml" xmlns:w16cid="http://schemas.microsoft.com/office/word/2016/wordml/cid" xmlns:w16se="http://schemas.microsoft.com/office/word/2015/wordml/symex" xmlns:wpg="http://schemas.microsoft.com/office/word/2010/wordprocessingGroup" xmlns:wpi="http://schemas.microsoft.com/office/word/2010/wordprocessingInk" xmlns:wne="http://schemas.microsoft.com/office/word/2006/wordml" xmlns:wps="http://schemas.microsoft.com/office/word/2010/wordprocessingShape" mc:Ignorable="w14 w15 w16se w16cid wp14">
   <w:body>
     <w:p>
       <w:pPr>
@@ -18,12 +18,13 @@
         <w:rPr>
           <w:rFonts w:ascii="Arial" w:hAnsi="Arial" w:cs="Arial"/>
           <w:b/>
+          <w:noProof/>
           <w:color w:val="FFFFFF" w:themeColor="background1"/>
           <w:sz w:val="36"/>
           <w:szCs w:val="36"/>
         </w:rPr>
         <w:drawing>
-          <wp:anchor distT="0" distB="0" distL="114300" distR="114300" simplePos="0" relativeHeight="251659264" behindDoc="0" locked="0" layoutInCell="1" allowOverlap="1" wp14:anchorId="129897EB" wp14:editId="40FEC263">
+          <wp:anchor distT="0" distB="0" distL="114300" distR="114300" simplePos="0" relativeHeight="251658240" behindDoc="0" locked="0" layoutInCell="1" allowOverlap="1" wp14:anchorId="129897EB" wp14:editId="668847FD">
             <wp:simplePos x="0" y="0"/>
             <wp:positionH relativeFrom="margin">
               <wp:align>center</wp:align>
@@ -218,7 +219,7 @@
           <w:szCs w:val="72"/>
         </w:rPr>
         <w:drawing>
-          <wp:anchor distT="0" distB="0" distL="114300" distR="114300" simplePos="0" relativeHeight="251660288" behindDoc="0" locked="0" layoutInCell="1" allowOverlap="1" wp14:anchorId="76D0457E" wp14:editId="087424DD">
+          <wp:anchor distT="0" distB="0" distL="114300" distR="114300" simplePos="0" relativeHeight="251659264" behindDoc="0" locked="0" layoutInCell="1" allowOverlap="1" wp14:anchorId="76D0457E" wp14:editId="153EAED2">
             <wp:simplePos x="0" y="0"/>
             <wp:positionH relativeFrom="margin">
               <wp:posOffset>3599749</wp:posOffset>
@@ -399,11 +400,7 @@
           <w:b w:val="0"/>
           <w:noProof/>
           <w:color w:val="auto"/>
-          <w:kern w:val="2"/>
-          <w:sz w:val="24"/>
-          <w:szCs w:val="24"/>
           <w:lang w:eastAsia="hu-HU"/>
-          <w14:ligatures w14:val="standardContextual"/>
         </w:rPr>
       </w:pPr>
       <w:r>
@@ -424,7 +421,7 @@
         </w:rPr>
         <w:fldChar w:fldCharType="separate"/>
       </w:r>
-      <w:hyperlink w:anchor="_Toc221634151" w:history="1">
+      <w:hyperlink w:anchor="_Toc221711455" w:history="1">
         <w:r>
           <w:rPr>
             <w:rStyle w:val="Hiperhivatkozs"/>
@@ -451,7 +448,7 @@
             <w:noProof/>
             <w:webHidden/>
           </w:rPr>
-          <w:instrText xml:space="preserve"> PAGEREF _Toc221634151 \h </w:instrText>
+          <w:instrText xml:space="preserve"> PAGEREF _Toc221711455 \h </w:instrText>
         </w:r>
         <w:r>
           <w:rPr>
@@ -493,14 +490,10 @@
           <w:i w:val="0"/>
           <w:noProof/>
           <w:color w:val="auto"/>
-          <w:kern w:val="2"/>
-          <w:sz w:val="24"/>
-          <w:szCs w:val="24"/>
           <w:lang w:eastAsia="hu-HU"/>
-          <w14:ligatures w14:val="standardContextual"/>
         </w:rPr>
       </w:pPr>
-      <w:hyperlink w:anchor="_Toc221634152" w:history="1">
+      <w:hyperlink w:anchor="_Toc221711456" w:history="1">
         <w:r>
           <w:rPr>
             <w:rStyle w:val="Hiperhivatkozs"/>
@@ -527,7 +520,7 @@
             <w:noProof/>
             <w:webHidden/>
           </w:rPr>
-          <w:instrText xml:space="preserve"> PAGEREF _Toc221634152 \h </w:instrText>
+          <w:instrText xml:space="preserve"> PAGEREF _Toc221711456 \h </w:instrText>
         </w:r>
         <w:r>
           <w:rPr>
@@ -569,14 +562,10 @@
           <w:i w:val="0"/>
           <w:noProof/>
           <w:color w:val="auto"/>
-          <w:kern w:val="2"/>
-          <w:sz w:val="24"/>
-          <w:szCs w:val="24"/>
           <w:lang w:eastAsia="hu-HU"/>
-          <w14:ligatures w14:val="standardContextual"/>
         </w:rPr>
       </w:pPr>
-      <w:hyperlink w:anchor="_Toc221634153" w:history="1">
+      <w:hyperlink w:anchor="_Toc221711457" w:history="1">
         <w:r>
           <w:rPr>
             <w:rStyle w:val="Hiperhivatkozs"/>
@@ -603,7 +592,7 @@
             <w:noProof/>
             <w:webHidden/>
           </w:rPr>
-          <w:instrText xml:space="preserve"> PAGEREF _Toc221634153 \h </w:instrText>
+          <w:instrText xml:space="preserve"> PAGEREF _Toc221711457 \h </w:instrText>
         </w:r>
         <w:r>
           <w:rPr>
@@ -645,14 +634,10 @@
           <w:i w:val="0"/>
           <w:noProof/>
           <w:color w:val="auto"/>
-          <w:kern w:val="2"/>
-          <w:sz w:val="24"/>
-          <w:szCs w:val="24"/>
           <w:lang w:eastAsia="hu-HU"/>
-          <w14:ligatures w14:val="standardContextual"/>
         </w:rPr>
       </w:pPr>
-      <w:hyperlink w:anchor="_Toc221634154" w:history="1">
+      <w:hyperlink w:anchor="_Toc221711458" w:history="1">
         <w:r>
           <w:rPr>
             <w:rStyle w:val="Hiperhivatkozs"/>
@@ -679,7 +664,7 @@
             <w:noProof/>
             <w:webHidden/>
           </w:rPr>
-          <w:instrText xml:space="preserve"> PAGEREF _Toc221634154 \h </w:instrText>
+          <w:instrText xml:space="preserve"> PAGEREF _Toc221711458 \h </w:instrText>
         </w:r>
         <w:r>
           <w:rPr>
@@ -718,14 +703,10 @@
           <w:b w:val="0"/>
           <w:noProof/>
           <w:color w:val="auto"/>
-          <w:kern w:val="2"/>
-          <w:sz w:val="24"/>
-          <w:szCs w:val="24"/>
           <w:lang w:eastAsia="hu-HU"/>
-          <w14:ligatures w14:val="standardContextual"/>
         </w:rPr>
       </w:pPr>
-      <w:hyperlink w:anchor="_Toc221634155" w:history="1">
+      <w:hyperlink w:anchor="_Toc221711459" w:history="1">
         <w:r>
           <w:rPr>
             <w:rStyle w:val="Hiperhivatkozs"/>
@@ -752,7 +733,7 @@
             <w:noProof/>
             <w:webHidden/>
           </w:rPr>
-          <w:instrText xml:space="preserve"> PAGEREF _Toc221634155 \h </w:instrText>
+          <w:instrText xml:space="preserve"> PAGEREF _Toc221711459 \h </w:instrText>
         </w:r>
         <w:r>
           <w:rPr>
@@ -794,14 +775,10 @@
           <w:i w:val="0"/>
           <w:noProof/>
           <w:color w:val="auto"/>
-          <w:kern w:val="2"/>
-          <w:sz w:val="24"/>
-          <w:szCs w:val="24"/>
           <w:lang w:eastAsia="hu-HU"/>
-          <w14:ligatures w14:val="standardContextual"/>
         </w:rPr>
       </w:pPr>
-      <w:hyperlink w:anchor="_Toc221634156" w:history="1">
+      <w:hyperlink w:anchor="_Toc221711460" w:history="1">
         <w:r>
           <w:rPr>
             <w:rStyle w:val="Hiperhivatkozs"/>
@@ -828,7 +805,7 @@
             <w:noProof/>
             <w:webHidden/>
           </w:rPr>
-          <w:instrText xml:space="preserve"> PAGEREF _Toc221634156 \h </w:instrText>
+          <w:instrText xml:space="preserve"> PAGEREF _Toc221711460 \h </w:instrText>
         </w:r>
         <w:r>
           <w:rPr>
@@ -870,14 +847,10 @@
           <w:i w:val="0"/>
           <w:noProof/>
           <w:color w:val="auto"/>
-          <w:kern w:val="2"/>
-          <w:sz w:val="24"/>
-          <w:szCs w:val="24"/>
           <w:lang w:eastAsia="hu-HU"/>
-          <w14:ligatures w14:val="standardContextual"/>
         </w:rPr>
       </w:pPr>
-      <w:hyperlink w:anchor="_Toc221634157" w:history="1">
+      <w:hyperlink w:anchor="_Toc221711461" w:history="1">
         <w:r>
           <w:rPr>
             <w:rStyle w:val="Hiperhivatkozs"/>
@@ -904,7 +877,7 @@
             <w:noProof/>
             <w:webHidden/>
           </w:rPr>
-          <w:instrText xml:space="preserve"> PAGEREF _Toc221634157 \h </w:instrText>
+          <w:instrText xml:space="preserve"> PAGEREF _Toc221711461 \h </w:instrText>
         </w:r>
         <w:r>
           <w:rPr>
@@ -943,14 +916,10 @@
           <w:b w:val="0"/>
           <w:noProof/>
           <w:color w:val="auto"/>
-          <w:kern w:val="2"/>
-          <w:sz w:val="24"/>
-          <w:szCs w:val="24"/>
           <w:lang w:eastAsia="hu-HU"/>
-          <w14:ligatures w14:val="standardContextual"/>
         </w:rPr>
       </w:pPr>
-      <w:hyperlink w:anchor="_Toc221634158" w:history="1">
+      <w:hyperlink w:anchor="_Toc221711462" w:history="1">
         <w:r>
           <w:rPr>
             <w:rStyle w:val="Hiperhivatkozs"/>
@@ -977,7 +946,7 @@
             <w:noProof/>
             <w:webHidden/>
           </w:rPr>
-          <w:instrText xml:space="preserve"> PAGEREF _Toc221634158 \h </w:instrText>
+          <w:instrText xml:space="preserve"> PAGEREF _Toc221711462 \h </w:instrText>
         </w:r>
         <w:r>
           <w:rPr>
@@ -1016,14 +985,10 @@
           <w:b w:val="0"/>
           <w:noProof/>
           <w:color w:val="auto"/>
-          <w:kern w:val="2"/>
-          <w:sz w:val="24"/>
-          <w:szCs w:val="24"/>
           <w:lang w:eastAsia="hu-HU"/>
-          <w14:ligatures w14:val="standardContextual"/>
         </w:rPr>
       </w:pPr>
-      <w:hyperlink w:anchor="_Toc221634159" w:history="1">
+      <w:hyperlink w:anchor="_Toc221711463" w:history="1">
         <w:r>
           <w:rPr>
             <w:rStyle w:val="Hiperhivatkozs"/>
@@ -1050,7 +1015,7 @@
             <w:noProof/>
             <w:webHidden/>
           </w:rPr>
-          <w:instrText xml:space="preserve"> PAGEREF _Toc221634159 \h </w:instrText>
+          <w:instrText xml:space="preserve"> PAGEREF _Toc221711463 \h </w:instrText>
         </w:r>
         <w:r>
           <w:rPr>
@@ -1089,14 +1054,10 @@
           <w:b w:val="0"/>
           <w:noProof/>
           <w:color w:val="auto"/>
-          <w:kern w:val="2"/>
-          <w:sz w:val="24"/>
-          <w:szCs w:val="24"/>
           <w:lang w:eastAsia="hu-HU"/>
-          <w14:ligatures w14:val="standardContextual"/>
         </w:rPr>
       </w:pPr>
-      <w:hyperlink w:anchor="_Toc221634160" w:history="1">
+      <w:hyperlink w:anchor="_Toc221711464" w:history="1">
         <w:r>
           <w:rPr>
             <w:rStyle w:val="Hiperhivatkozs"/>
@@ -1123,7 +1084,7 @@
             <w:noProof/>
             <w:webHidden/>
           </w:rPr>
-          <w:instrText xml:space="preserve"> PAGEREF _Toc221634160 \h </w:instrText>
+          <w:instrText xml:space="preserve"> PAGEREF _Toc221711464 \h </w:instrText>
         </w:r>
         <w:r>
           <w:rPr>
@@ -1172,7 +1133,7 @@
         <w:pStyle w:val="Cm"/>
       </w:pPr>
       <w:bookmarkStart w:id="0" w:name="_Toc220930350"/>
-      <w:bookmarkStart w:id="1" w:name="_Toc221634151"/>
+      <w:bookmarkStart w:id="1" w:name="_Toc221711455"/>
       <w:r>
         <w:lastRenderedPageBreak/>
         <w:t>Bevezetés</w:t>
@@ -1185,7 +1146,7 @@
         <w:pStyle w:val="Cmsor1"/>
       </w:pPr>
       <w:bookmarkStart w:id="2" w:name="_Toc220930351"/>
-      <w:bookmarkStart w:id="3" w:name="_Toc221634152"/>
+      <w:bookmarkStart w:id="3" w:name="_Toc221711456"/>
       <w:r>
         <w:t>Témaválasztás indoklása</w:t>
       </w:r>
@@ -1205,7 +1166,7 @@
         <w:pStyle w:val="Cmsor1"/>
       </w:pPr>
       <w:bookmarkStart w:id="4" w:name="_Toc220930352"/>
-      <w:bookmarkStart w:id="5" w:name="_Toc221634153"/>
+      <w:bookmarkStart w:id="5" w:name="_Toc221711457"/>
       <w:r>
         <w:t>Célkitűzés</w:t>
       </w:r>
@@ -1381,7 +1342,7 @@
       <w:pPr>
         <w:pStyle w:val="Cmsor1"/>
       </w:pPr>
-      <w:bookmarkStart w:id="6" w:name="_Toc221634154"/>
+      <w:bookmarkStart w:id="6" w:name="_Toc221711458"/>
       <w:r>
         <w:t>Oldal különlegességei, elnevezése</w:t>
       </w:r>
@@ -1439,7 +1400,7 @@
         <w:pStyle w:val="Cm"/>
       </w:pPr>
       <w:bookmarkStart w:id="7" w:name="_Toc220930353"/>
-      <w:bookmarkStart w:id="8" w:name="_Toc221634155"/>
+      <w:bookmarkStart w:id="8" w:name="_Toc221711459"/>
       <w:r>
         <w:lastRenderedPageBreak/>
         <w:t>Fejlesztői dokumentáció</w:t>
@@ -1451,7 +1412,7 @@
       <w:pPr>
         <w:pStyle w:val="Cmsor1"/>
       </w:pPr>
-      <w:bookmarkStart w:id="9" w:name="_Toc221634156"/>
+      <w:bookmarkStart w:id="9" w:name="_Toc221711460"/>
       <w:r>
         <w:t>Fejlesztői környezet</w:t>
       </w:r>
@@ -1541,18 +1502,18 @@
         <mc:AlternateContent>
           <mc:Choice Requires="wpg">
             <w:drawing>
-              <wp:anchor distT="0" distB="0" distL="114300" distR="114300" simplePos="0" relativeHeight="251668480" behindDoc="0" locked="0" layoutInCell="1" allowOverlap="1" wp14:anchorId="6E496BBD" wp14:editId="6D6E0EC9">
+              <wp:anchor distT="0" distB="0" distL="114300" distR="114300" simplePos="0" relativeHeight="251671552" behindDoc="0" locked="0" layoutInCell="1" allowOverlap="1" wp14:anchorId="64539C07" wp14:editId="4369F872">
                 <wp:simplePos x="0" y="0"/>
                 <wp:positionH relativeFrom="column">
-                  <wp:posOffset>596673</wp:posOffset>
+                  <wp:posOffset>3394821</wp:posOffset>
                 </wp:positionH>
                 <wp:positionV relativeFrom="paragraph">
-                  <wp:posOffset>83555</wp:posOffset>
+                  <wp:posOffset>75565</wp:posOffset>
                 </wp:positionV>
-                <wp:extent cx="46847" cy="421404"/>
-                <wp:effectExtent l="0" t="0" r="10795" b="17145"/>
+                <wp:extent cx="55245" cy="432435"/>
+                <wp:effectExtent l="0" t="0" r="1905" b="5715"/>
                 <wp:wrapNone/>
-                <wp:docPr id="1853724022" name="Csoportba foglalás 1853724022"/>
+                <wp:docPr id="6" name="Csoportba foglalás 6"/>
                 <wp:cNvGraphicFramePr/>
                 <a:graphic xmlns:a="http://schemas.openxmlformats.org/drawingml/2006/main">
                   <a:graphicData uri="http://schemas.microsoft.com/office/word/2010/wordprocessingGroup">
@@ -1561,22 +1522,25 @@
                       <wpg:grpSpPr>
                         <a:xfrm>
                           <a:off x="0" y="0"/>
-                          <a:ext cx="46847" cy="421404"/>
-                          <a:chOff x="5934" y="5610"/>
-                          <a:chExt cx="46847" cy="421404"/>
+                          <a:ext cx="55245" cy="432435"/>
+                          <a:chOff x="0" y="0"/>
+                          <a:chExt cx="55245" cy="432435"/>
                         </a:xfrm>
                       </wpg:grpSpPr>
                       <wps:wsp>
-                        <wps:cNvPr id="1331549611" name="Ellipszis 1331549611"/>
+                        <wps:cNvPr id="1" name="Ellipszis 1"/>
                         <wps:cNvSpPr/>
                         <wps:spPr>
-                          <a:xfrm flipH="1">
-                            <a:off x="5934" y="5610"/>
-                            <a:ext cx="45720" cy="45720"/>
+                          <a:xfrm>
+                            <a:off x="1905" y="0"/>
+                            <a:ext cx="53340" cy="49530"/>
                           </a:xfrm>
                           <a:prstGeom prst="ellipse">
                             <a:avLst/>
                           </a:prstGeom>
+                          <a:ln>
+                            <a:noFill/>
+                          </a:ln>
                         </wps:spPr>
                         <wps:style>
                           <a:lnRef idx="2">
@@ -1602,16 +1566,19 @@
                         </wps:bodyPr>
                       </wps:wsp>
                       <wps:wsp>
-                        <wps:cNvPr id="955660643" name="Ellipszis 955660643"/>
+                        <wps:cNvPr id="2" name="Ellipszis 2"/>
                         <wps:cNvSpPr/>
                         <wps:spPr>
-                          <a:xfrm flipH="1">
-                            <a:off x="7061" y="190647"/>
-                            <a:ext cx="45720" cy="45720"/>
+                          <a:xfrm>
+                            <a:off x="1905" y="192405"/>
+                            <a:ext cx="53340" cy="49530"/>
                           </a:xfrm>
                           <a:prstGeom prst="ellipse">
                             <a:avLst/>
                           </a:prstGeom>
+                          <a:ln>
+                            <a:noFill/>
+                          </a:ln>
                         </wps:spPr>
                         <wps:style>
                           <a:lnRef idx="2">
@@ -1637,16 +1604,19 @@
                         </wps:bodyPr>
                       </wps:wsp>
                       <wps:wsp>
-                        <wps:cNvPr id="119190994" name="Ellipszis 119190994"/>
+                        <wps:cNvPr id="4" name="Ellipszis 4"/>
                         <wps:cNvSpPr/>
                         <wps:spPr>
-                          <a:xfrm flipH="1">
-                            <a:off x="7059" y="381294"/>
-                            <a:ext cx="45720" cy="45720"/>
+                          <a:xfrm>
+                            <a:off x="0" y="382905"/>
+                            <a:ext cx="53340" cy="49530"/>
                           </a:xfrm>
                           <a:prstGeom prst="ellipse">
                             <a:avLst/>
                           </a:prstGeom>
+                          <a:ln>
+                            <a:noFill/>
+                          </a:ln>
                         </wps:spPr>
                         <wps:style>
                           <a:lnRef idx="2">
@@ -1674,191 +1644,19 @@
                     </wpg:wgp>
                   </a:graphicData>
                 </a:graphic>
-                <wp14:sizeRelH relativeFrom="margin">
-                  <wp14:pctWidth>0</wp14:pctWidth>
-                </wp14:sizeRelH>
-                <wp14:sizeRelV relativeFrom="margin">
-                  <wp14:pctHeight>0</wp14:pctHeight>
-                </wp14:sizeRelV>
               </wp:anchor>
             </w:drawing>
           </mc:Choice>
           <mc:Fallback>
             <w:pict>
-              <v:group w14:anchorId="5E0017F4" id="Csoportba foglalás 1853724022" o:spid="_x0000_s1026" style="position:absolute;margin-left:47pt;margin-top:6.6pt;width:3.7pt;height:33.2pt;z-index:251668480;mso-width-relative:margin;mso-height-relative:margin" coordorigin="5934,5610" coordsize="46847,421404" o:gfxdata="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">
-                <v:oval id="Ellipszis 1331549611" o:spid="_x0000_s1027" style="position:absolute;left:5934;top:5610;width:45720;height:45720;flip:x;visibility:visible;mso-wrap-style:square;v-text-anchor:middle" o:gfxdata="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" fillcolor="black [3200]" strokecolor="black [1600]" strokeweight="1pt">
+              <v:group w14:anchorId="02BE89A3" id="Csoportba foglalás 6" o:spid="_x0000_s1026" style="position:absolute;margin-left:267.3pt;margin-top:5.95pt;width:4.35pt;height:34.05pt;z-index:251671552" coordsize="55245,432435" o:gfxdata="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">
+                <v:oval id="Ellipszis 1" o:spid="_x0000_s1027" style="position:absolute;left:1905;width:53340;height:49530;visibility:visible;mso-wrap-style:square;v-text-anchor:middle" o:gfxdata="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" fillcolor="black [3200]" stroked="f" strokeweight="1pt">
                   <v:stroke joinstyle="miter"/>
                 </v:oval>
-                <v:oval id="Ellipszis 955660643" o:spid="_x0000_s1028" style="position:absolute;left:7061;top:190647;width:45720;height:45720;flip:x;visibility:visible;mso-wrap-style:square;v-text-anchor:middle" o:gfxdata="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" fillcolor="black [3200]" strokecolor="black [1600]" strokeweight="1pt">
+                <v:oval id="Ellipszis 2" o:spid="_x0000_s1028" style="position:absolute;left:1905;top:192405;width:53340;height:49530;visibility:visible;mso-wrap-style:square;v-text-anchor:middle" o:gfxdata="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" fillcolor="black [3200]" stroked="f" strokeweight="1pt">
                   <v:stroke joinstyle="miter"/>
                 </v:oval>
-                <v:oval id="Ellipszis 119190994" o:spid="_x0000_s1029" style="position:absolute;left:7059;top:381294;width:45720;height:45720;flip:x;visibility:visible;mso-wrap-style:square;v-text-anchor:middle" o:gfxdata="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" fillcolor="black [3200]" strokecolor="black [1600]" strokeweight="1pt">
-                  <v:stroke joinstyle="miter"/>
-                </v:oval>
-              </v:group>
-            </w:pict>
-          </mc:Fallback>
-        </mc:AlternateContent>
-      </w:r>
-      <w:r>
-        <w:rPr>
-          <w:noProof/>
-        </w:rPr>
-        <mc:AlternateContent>
-          <mc:Choice Requires="wpg">
-            <w:drawing>
-              <wp:anchor distT="0" distB="0" distL="114300" distR="114300" simplePos="0" relativeHeight="251666432" behindDoc="0" locked="0" layoutInCell="1" allowOverlap="1" wp14:anchorId="23D12863" wp14:editId="170B7C48">
-                <wp:simplePos x="0" y="0"/>
-                <wp:positionH relativeFrom="column">
-                  <wp:posOffset>3446444</wp:posOffset>
-                </wp:positionH>
-                <wp:positionV relativeFrom="paragraph">
-                  <wp:posOffset>81331</wp:posOffset>
-                </wp:positionV>
-                <wp:extent cx="46847" cy="421404"/>
-                <wp:effectExtent l="0" t="0" r="10795" b="17145"/>
-                <wp:wrapNone/>
-                <wp:docPr id="18" name="Csoportba foglalás 18"/>
-                <wp:cNvGraphicFramePr/>
-                <a:graphic xmlns:a="http://schemas.openxmlformats.org/drawingml/2006/main">
-                  <a:graphicData uri="http://schemas.microsoft.com/office/word/2010/wordprocessingGroup">
-                    <wpg:wgp>
-                      <wpg:cNvGrpSpPr/>
-                      <wpg:grpSpPr>
-                        <a:xfrm>
-                          <a:off x="0" y="0"/>
-                          <a:ext cx="46847" cy="421404"/>
-                          <a:chOff x="5934" y="5610"/>
-                          <a:chExt cx="46847" cy="421404"/>
-                        </a:xfrm>
-                      </wpg:grpSpPr>
-                      <wps:wsp>
-                        <wps:cNvPr id="5" name="Ellipszis 5"/>
-                        <wps:cNvSpPr/>
-                        <wps:spPr>
-                          <a:xfrm flipH="1">
-                            <a:off x="5934" y="5610"/>
-                            <a:ext cx="45720" cy="45720"/>
-                          </a:xfrm>
-                          <a:prstGeom prst="ellipse">
-                            <a:avLst/>
-                          </a:prstGeom>
-                        </wps:spPr>
-                        <wps:style>
-                          <a:lnRef idx="2">
-                            <a:schemeClr val="dk1">
-                              <a:shade val="50000"/>
-                            </a:schemeClr>
-                          </a:lnRef>
-                          <a:fillRef idx="1">
-                            <a:schemeClr val="dk1"/>
-                          </a:fillRef>
-                          <a:effectRef idx="0">
-                            <a:schemeClr val="dk1"/>
-                          </a:effectRef>
-                          <a:fontRef idx="minor">
-                            <a:schemeClr val="lt1"/>
-                          </a:fontRef>
-                        </wps:style>
-                        <wps:bodyPr rot="0" spcFirstLastPara="0" vertOverflow="overflow" horzOverflow="overflow" vert="horz" wrap="square" lIns="91440" tIns="45720" rIns="91440" bIns="45720" numCol="1" spcCol="0" rtlCol="0" fromWordArt="0" anchor="ctr" anchorCtr="0" forceAA="0" compatLnSpc="1">
-                          <a:prstTxWarp prst="textNoShape">
-                            <a:avLst/>
-                          </a:prstTxWarp>
-                          <a:noAutofit/>
-                        </wps:bodyPr>
-                      </wps:wsp>
-                      <wps:wsp>
-                        <wps:cNvPr id="16" name="Ellipszis 16"/>
-                        <wps:cNvSpPr/>
-                        <wps:spPr>
-                          <a:xfrm flipH="1">
-                            <a:off x="7061" y="190647"/>
-                            <a:ext cx="45720" cy="45720"/>
-                          </a:xfrm>
-                          <a:prstGeom prst="ellipse">
-                            <a:avLst/>
-                          </a:prstGeom>
-                        </wps:spPr>
-                        <wps:style>
-                          <a:lnRef idx="2">
-                            <a:schemeClr val="dk1">
-                              <a:shade val="50000"/>
-                            </a:schemeClr>
-                          </a:lnRef>
-                          <a:fillRef idx="1">
-                            <a:schemeClr val="dk1"/>
-                          </a:fillRef>
-                          <a:effectRef idx="0">
-                            <a:schemeClr val="dk1"/>
-                          </a:effectRef>
-                          <a:fontRef idx="minor">
-                            <a:schemeClr val="lt1"/>
-                          </a:fontRef>
-                        </wps:style>
-                        <wps:bodyPr rot="0" spcFirstLastPara="0" vertOverflow="overflow" horzOverflow="overflow" vert="horz" wrap="square" lIns="91440" tIns="45720" rIns="91440" bIns="45720" numCol="1" spcCol="0" rtlCol="0" fromWordArt="0" anchor="ctr" anchorCtr="0" forceAA="0" compatLnSpc="1">
-                          <a:prstTxWarp prst="textNoShape">
-                            <a:avLst/>
-                          </a:prstTxWarp>
-                          <a:noAutofit/>
-                        </wps:bodyPr>
-                      </wps:wsp>
-                      <wps:wsp>
-                        <wps:cNvPr id="17" name="Ellipszis 17"/>
-                        <wps:cNvSpPr/>
-                        <wps:spPr>
-                          <a:xfrm flipH="1">
-                            <a:off x="7059" y="381294"/>
-                            <a:ext cx="45720" cy="45720"/>
-                          </a:xfrm>
-                          <a:prstGeom prst="ellipse">
-                            <a:avLst/>
-                          </a:prstGeom>
-                        </wps:spPr>
-                        <wps:style>
-                          <a:lnRef idx="2">
-                            <a:schemeClr val="dk1">
-                              <a:shade val="50000"/>
-                            </a:schemeClr>
-                          </a:lnRef>
-                          <a:fillRef idx="1">
-                            <a:schemeClr val="dk1"/>
-                          </a:fillRef>
-                          <a:effectRef idx="0">
-                            <a:schemeClr val="dk1"/>
-                          </a:effectRef>
-                          <a:fontRef idx="minor">
-                            <a:schemeClr val="lt1"/>
-                          </a:fontRef>
-                        </wps:style>
-                        <wps:bodyPr rot="0" spcFirstLastPara="0" vertOverflow="overflow" horzOverflow="overflow" vert="horz" wrap="square" lIns="91440" tIns="45720" rIns="91440" bIns="45720" numCol="1" spcCol="0" rtlCol="0" fromWordArt="0" anchor="ctr" anchorCtr="0" forceAA="0" compatLnSpc="1">
-                          <a:prstTxWarp prst="textNoShape">
-                            <a:avLst/>
-                          </a:prstTxWarp>
-                          <a:noAutofit/>
-                        </wps:bodyPr>
-                      </wps:wsp>
-                    </wpg:wgp>
-                  </a:graphicData>
-                </a:graphic>
-                <wp14:sizeRelH relativeFrom="margin">
-                  <wp14:pctWidth>0</wp14:pctWidth>
-                </wp14:sizeRelH>
-                <wp14:sizeRelV relativeFrom="margin">
-                  <wp14:pctHeight>0</wp14:pctHeight>
-                </wp14:sizeRelV>
-              </wp:anchor>
-            </w:drawing>
-          </mc:Choice>
-          <mc:Fallback>
-            <w:pict>
-              <v:group w14:anchorId="7DB3761C" id="Csoportba foglalás 18" o:spid="_x0000_s1026" style="position:absolute;margin-left:271.35pt;margin-top:6.4pt;width:3.7pt;height:33.2pt;z-index:251666432;mso-width-relative:margin;mso-height-relative:margin" coordorigin="5934,5610" coordsize="46847,421404" o:gfxdata="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">
-                <v:oval id="Ellipszis 5" o:spid="_x0000_s1027" style="position:absolute;left:5934;top:5610;width:45720;height:45720;flip:x;visibility:visible;mso-wrap-style:square;v-text-anchor:middle" o:gfxdata="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" fillcolor="black [3200]" strokecolor="black [1600]" strokeweight="1pt">
-                  <v:stroke joinstyle="miter"/>
-                </v:oval>
-                <v:oval id="Ellipszis 16" o:spid="_x0000_s1028" style="position:absolute;left:7061;top:190647;width:45720;height:45720;flip:x;visibility:visible;mso-wrap-style:square;v-text-anchor:middle" o:gfxdata="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" fillcolor="black [3200]" strokecolor="black [1600]" strokeweight="1pt">
-                  <v:stroke joinstyle="miter"/>
-                </v:oval>
-                <v:oval id="Ellipszis 17" o:spid="_x0000_s1029" style="position:absolute;left:7059;top:381294;width:45720;height:45720;flip:x;visibility:visible;mso-wrap-style:square;v-text-anchor:middle" o:gfxdata="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" fillcolor="black [3200]" strokecolor="black [1600]" strokeweight="1pt">
+                <v:oval id="Ellipszis 4" o:spid="_x0000_s1029" style="position:absolute;top:382905;width:53340;height:49530;visibility:visible;mso-wrap-style:square;v-text-anchor:middle" o:gfxdata="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" fillcolor="black [3200]" stroked="f" strokeweight="1pt">
                   <v:stroke joinstyle="miter"/>
                 </v:oval>
               </v:group>
@@ -1996,7 +1794,7 @@
         <w:spacing w:after="200"/>
         <w:ind w:left="284"/>
       </w:pPr>
-      <w:bookmarkStart w:id="10" w:name="_Toc221634157"/>
+      <w:bookmarkStart w:id="10" w:name="_Toc221711461"/>
       <w:r>
         <w:t>Fejlesztésre használt eszközök</w:t>
       </w:r>
@@ -2053,45 +1851,71 @@
         </w:numPr>
         <w:ind w:left="1276"/>
       </w:pPr>
+      <w:proofErr w:type="spellStart"/>
+      <w:r>
+        <w:t>WinSCP</w:t>
+      </w:r>
+      <w:proofErr w:type="spellEnd"/>
+      <w:r>
+        <w:t xml:space="preserve"> (</w:t>
+      </w:r>
+      <w:r>
+        <w:t>FTP kapcsolat a webtárhelyre</w:t>
+      </w:r>
+      <w:r>
+        <w:t>)</w:t>
+      </w:r>
+    </w:p>
+    <w:p>
+      <w:pPr>
+        <w:pStyle w:val="Listaszerbekezds"/>
+        <w:numPr>
+          <w:ilvl w:val="0"/>
+          <w:numId w:val="8"/>
+        </w:numPr>
+        <w:ind w:left="1276"/>
+      </w:pPr>
       <w:r>
         <w:t>Windows 10-11 (Operációs rendszer)</w:t>
       </w:r>
+      <w:bookmarkStart w:id="11" w:name="_GoBack"/>
+      <w:bookmarkEnd w:id="11"/>
     </w:p>
     <w:p>
       <w:pPr>
         <w:pStyle w:val="Cm"/>
       </w:pPr>
-      <w:bookmarkStart w:id="11" w:name="_Toc220930354"/>
-      <w:bookmarkStart w:id="12" w:name="_Toc221634158"/>
+      <w:bookmarkStart w:id="12" w:name="_Toc220930354"/>
+      <w:bookmarkStart w:id="13" w:name="_Toc221711462"/>
       <w:r>
         <w:t>Felhasználói dokumentáció</w:t>
       </w:r>
-      <w:bookmarkEnd w:id="11"/>
       <w:bookmarkEnd w:id="12"/>
+      <w:bookmarkEnd w:id="13"/>
     </w:p>
     <w:p>
       <w:pPr>
         <w:pStyle w:val="Cm"/>
       </w:pPr>
-      <w:bookmarkStart w:id="13" w:name="_Toc220930355"/>
-      <w:bookmarkStart w:id="14" w:name="_Toc221634159"/>
+      <w:bookmarkStart w:id="14" w:name="_Toc220930355"/>
+      <w:bookmarkStart w:id="15" w:name="_Toc221711463"/>
       <w:r>
         <w:t>Összefoglalás</w:t>
       </w:r>
-      <w:bookmarkEnd w:id="13"/>
       <w:bookmarkEnd w:id="14"/>
+      <w:bookmarkEnd w:id="15"/>
     </w:p>
     <w:p>
       <w:pPr>
         <w:pStyle w:val="Cm"/>
       </w:pPr>
-      <w:bookmarkStart w:id="15" w:name="_Toc220930356"/>
-      <w:bookmarkStart w:id="16" w:name="_Toc221634160"/>
+      <w:bookmarkStart w:id="16" w:name="_Toc220930356"/>
+      <w:bookmarkStart w:id="17" w:name="_Toc221711464"/>
       <w:r>
         <w:t>Irodalomjegyzék</w:t>
       </w:r>
-      <w:bookmarkEnd w:id="15"/>
       <w:bookmarkEnd w:id="16"/>
+      <w:bookmarkEnd w:id="17"/>
     </w:p>
     <w:sectPr>
       <w:footerReference w:type="default" r:id="rId11"/>
@@ -2111,7 +1935,7 @@
 </file>
 
 <file path=word/endnotes.xml><?xml version="1.0" encoding="utf-8"?>
-<w:endnotes xmlns:wpc="http://schemas.microsoft.com/office/word/2010/wordprocessingCanvas" xmlns:cx="http://schemas.microsoft.com/office/drawing/2014/chartex" xmlns:cx1="http://schemas.microsoft.com/office/drawing/2015/9/8/chartex" xmlns:cx2="http://schemas.microsoft.com/office/drawing/2015/10/21/chartex" xmlns:cx3="http://schemas.microsoft.com/office/drawing/2016/5/9/chartex" xmlns:cx4="http://schemas.microsoft.com/office/drawing/2016/5/10/chartex" xmlns:cx5="http://schemas.microsoft.com/office/drawing/2016/5/11/chartex" xmlns:cx6="http://schemas.microsoft.com/office/drawing/2016/5/12/chartex" xmlns:cx7="http://schemas.microsoft.com/office/drawing/2016/5/13/chartex" xmlns:cx8="http://schemas.microsoft.com/office/drawing/2016/5/14/chartex" xmlns:mc="http://schemas.openxmlformats.org/markup-compatibility/2006" xmlns:aink="http://schemas.microsoft.com/office/drawing/2016/ink" xmlns:am3d="http://schemas.microsoft.com/office/drawing/2017/model3d" xmlns:o="urn:schemas-microsoft-com:office:office" xmlns:oel="http://schemas.microsoft.com/office/2019/extlst" xmlns:r="http://schemas.openxmlformats.org/officeDocument/2006/relationships" xmlns:m="http://schemas.openxmlformats.org/officeDocument/2006/math" xmlns:v="urn:schemas-microsoft-com:vml" xmlns:wp14="http://schemas.microsoft.com/office/word/2010/wordprocessingDrawing" xmlns:wp="http://schemas.openxmlformats.org/drawingml/2006/wordprocessingDrawing" xmlns:w10="urn:schemas-microsoft-com:office:word" xmlns:w="http://schemas.openxmlformats.org/wordprocessingml/2006/main" xmlns:w14="http://schemas.microsoft.com/office/word/2010/wordml" xmlns:w15="http://schemas.microsoft.com/office/word/2012/wordml" xmlns:w16cex="http://schemas.microsoft.com/office/word/2018/wordml/cex" xmlns:w16cid="http://schemas.microsoft.com/office/word/2016/wordml/cid" xmlns:w16="http://schemas.microsoft.com/office/word/2018/wordml" xmlns:w16du="http://schemas.microsoft.com/office/word/2023/wordml/word16du" xmlns:w16sdtdh="http://schemas.microsoft.com/office/word/2020/wordml/sdtdatahash" xmlns:w16sdtfl="http://schemas.microsoft.com/office/word/2024/wordml/sdtformatlock" xmlns:w16se="http://schemas.microsoft.com/office/word/2015/wordml/symex" xmlns:wpg="http://schemas.microsoft.com/office/word/2010/wordprocessingGroup" xmlns:wpi="http://schemas.microsoft.com/office/word/2010/wordprocessingInk" xmlns:wne="http://schemas.microsoft.com/office/word/2006/wordml" xmlns:wps="http://schemas.microsoft.com/office/word/2010/wordprocessingShape" mc:Ignorable="w14 w15 w16se w16cid w16 w16cex w16sdtdh w16sdtfl w16du wp14">
+<w:endnotes xmlns:wpc="http://schemas.microsoft.com/office/word/2010/wordprocessingCanvas" xmlns:cx="http://schemas.microsoft.com/office/drawing/2014/chartex" xmlns:cx1="http://schemas.microsoft.com/office/drawing/2015/9/8/chartex" xmlns:cx2="http://schemas.microsoft.com/office/drawing/2015/10/21/chartex" xmlns:cx3="http://schemas.microsoft.com/office/drawing/2016/5/9/chartex" xmlns:cx4="http://schemas.microsoft.com/office/drawing/2016/5/10/chartex" xmlns:cx5="http://schemas.microsoft.com/office/drawing/2016/5/11/chartex" xmlns:cx6="http://schemas.microsoft.com/office/drawing/2016/5/12/chartex" xmlns:cx7="http://schemas.microsoft.com/office/drawing/2016/5/13/chartex" xmlns:cx8="http://schemas.microsoft.com/office/drawing/2016/5/14/chartex" xmlns:mc="http://schemas.openxmlformats.org/markup-compatibility/2006" xmlns:aink="http://schemas.microsoft.com/office/drawing/2016/ink" xmlns:am3d="http://schemas.microsoft.com/office/drawing/2017/model3d" xmlns:o="urn:schemas-microsoft-com:office:office" xmlns:r="http://schemas.openxmlformats.org/officeDocument/2006/relationships" xmlns:m="http://schemas.openxmlformats.org/officeDocument/2006/math" xmlns:v="urn:schemas-microsoft-com:vml" xmlns:wp14="http://schemas.microsoft.com/office/word/2010/wordprocessingDrawing" xmlns:wp="http://schemas.openxmlformats.org/drawingml/2006/wordprocessingDrawing" xmlns:w10="urn:schemas-microsoft-com:office:word" xmlns:w="http://schemas.openxmlformats.org/wordprocessingml/2006/main" xmlns:w14="http://schemas.microsoft.com/office/word/2010/wordml" xmlns:w15="http://schemas.microsoft.com/office/word/2012/wordml" xmlns:w16cid="http://schemas.microsoft.com/office/word/2016/wordml/cid" xmlns:w16se="http://schemas.microsoft.com/office/word/2015/wordml/symex" xmlns:wpg="http://schemas.microsoft.com/office/word/2010/wordprocessingGroup" xmlns:wpi="http://schemas.microsoft.com/office/word/2010/wordprocessingInk" xmlns:wne="http://schemas.microsoft.com/office/word/2006/wordml" xmlns:wps="http://schemas.microsoft.com/office/word/2010/wordprocessingShape" mc:Ignorable="w14 w15 w16se w16cid wp14">
   <w:endnote w:type="separator" w:id="-1">
     <w:p>
       <w:pPr>
@@ -2136,7 +1960,7 @@
 </file>
 
 <file path=word/footer1.xml><?xml version="1.0" encoding="utf-8"?>
-<w:ftr xmlns:wpc="http://schemas.microsoft.com/office/word/2010/wordprocessingCanvas" xmlns:cx="http://schemas.microsoft.com/office/drawing/2014/chartex" xmlns:cx1="http://schemas.microsoft.com/office/drawing/2015/9/8/chartex" xmlns:cx2="http://schemas.microsoft.com/office/drawing/2015/10/21/chartex" xmlns:cx3="http://schemas.microsoft.com/office/drawing/2016/5/9/chartex" xmlns:cx4="http://schemas.microsoft.com/office/drawing/2016/5/10/chartex" xmlns:cx5="http://schemas.microsoft.com/office/drawing/2016/5/11/chartex" xmlns:cx6="http://schemas.microsoft.com/office/drawing/2016/5/12/chartex" xmlns:cx7="http://schemas.microsoft.com/office/drawing/2016/5/13/chartex" xmlns:cx8="http://schemas.microsoft.com/office/drawing/2016/5/14/chartex" xmlns:mc="http://schemas.openxmlformats.org/markup-compatibility/2006" xmlns:aink="http://schemas.microsoft.com/office/drawing/2016/ink" xmlns:am3d="http://schemas.microsoft.com/office/drawing/2017/model3d" xmlns:o="urn:schemas-microsoft-com:office:office" xmlns:oel="http://schemas.microsoft.com/office/2019/extlst" xmlns:r="http://schemas.openxmlformats.org/officeDocument/2006/relationships" xmlns:m="http://schemas.openxmlformats.org/officeDocument/2006/math" xmlns:v="urn:schemas-microsoft-com:vml" xmlns:wp14="http://schemas.microsoft.com/office/word/2010/wordprocessingDrawing" xmlns:wp="http://schemas.openxmlformats.org/drawingml/2006/wordprocessingDrawing" xmlns:w10="urn:schemas-microsoft-com:office:word" xmlns:w="http://schemas.openxmlformats.org/wordprocessingml/2006/main" xmlns:w14="http://schemas.microsoft.com/office/word/2010/wordml" xmlns:w15="http://schemas.microsoft.com/office/word/2012/wordml" xmlns:w16cex="http://schemas.microsoft.com/office/word/2018/wordml/cex" xmlns:w16cid="http://schemas.microsoft.com/office/word/2016/wordml/cid" xmlns:w16="http://schemas.microsoft.com/office/word/2018/wordml" xmlns:w16du="http://schemas.microsoft.com/office/word/2023/wordml/word16du" xmlns:w16sdtdh="http://schemas.microsoft.com/office/word/2020/wordml/sdtdatahash" xmlns:w16sdtfl="http://schemas.microsoft.com/office/word/2024/wordml/sdtformatlock" xmlns:w16se="http://schemas.microsoft.com/office/word/2015/wordml/symex" xmlns:wpg="http://schemas.microsoft.com/office/word/2010/wordprocessingGroup" xmlns:wpi="http://schemas.microsoft.com/office/word/2010/wordprocessingInk" xmlns:wne="http://schemas.microsoft.com/office/word/2006/wordml" xmlns:wps="http://schemas.microsoft.com/office/word/2010/wordprocessingShape" mc:Ignorable="w14 w15 w16se w16cid w16 w16cex w16sdtdh w16sdtfl w16du wp14">
+<w:ftr xmlns:wpc="http://schemas.microsoft.com/office/word/2010/wordprocessingCanvas" xmlns:cx="http://schemas.microsoft.com/office/drawing/2014/chartex" xmlns:cx1="http://schemas.microsoft.com/office/drawing/2015/9/8/chartex" xmlns:cx2="http://schemas.microsoft.com/office/drawing/2015/10/21/chartex" xmlns:cx3="http://schemas.microsoft.com/office/drawing/2016/5/9/chartex" xmlns:cx4="http://schemas.microsoft.com/office/drawing/2016/5/10/chartex" xmlns:cx5="http://schemas.microsoft.com/office/drawing/2016/5/11/chartex" xmlns:cx6="http://schemas.microsoft.com/office/drawing/2016/5/12/chartex" xmlns:cx7="http://schemas.microsoft.com/office/drawing/2016/5/13/chartex" xmlns:cx8="http://schemas.microsoft.com/office/drawing/2016/5/14/chartex" xmlns:mc="http://schemas.openxmlformats.org/markup-compatibility/2006" xmlns:aink="http://schemas.microsoft.com/office/drawing/2016/ink" xmlns:am3d="http://schemas.microsoft.com/office/drawing/2017/model3d" xmlns:o="urn:schemas-microsoft-com:office:office" xmlns:r="http://schemas.openxmlformats.org/officeDocument/2006/relationships" xmlns:m="http://schemas.openxmlformats.org/officeDocument/2006/math" xmlns:v="urn:schemas-microsoft-com:vml" xmlns:wp14="http://schemas.microsoft.com/office/word/2010/wordprocessingDrawing" xmlns:wp="http://schemas.openxmlformats.org/drawingml/2006/wordprocessingDrawing" xmlns:w10="urn:schemas-microsoft-com:office:word" xmlns:w="http://schemas.openxmlformats.org/wordprocessingml/2006/main" xmlns:w14="http://schemas.microsoft.com/office/word/2010/wordml" xmlns:w15="http://schemas.microsoft.com/office/word/2012/wordml" xmlns:w16cid="http://schemas.microsoft.com/office/word/2016/wordml/cid" xmlns:w16se="http://schemas.microsoft.com/office/word/2015/wordml/symex" xmlns:wpg="http://schemas.microsoft.com/office/word/2010/wordprocessingGroup" xmlns:wpi="http://schemas.microsoft.com/office/word/2010/wordprocessingInk" xmlns:wne="http://schemas.microsoft.com/office/word/2006/wordml" xmlns:wps="http://schemas.microsoft.com/office/word/2010/wordprocessingShape" mc:Ignorable="w14 w15 w16se w16cid wp14">
   <w:sdt>
     <w:sdtPr>
       <w:rPr>
@@ -2335,7 +2159,7 @@
                 </wp:anchor>
               </w:drawing>
             </mc:Choice>
-            <mc:Fallback>
+            <mc:Fallback xmlns:w16sdtfl="http://schemas.microsoft.com/office/word/2024/wordml/sdtformatlock" xmlns:w16sdtdh="http://schemas.microsoft.com/office/word/2020/wordml/sdtdatahash" xmlns:w16du="http://schemas.microsoft.com/office/word/2023/wordml/word16du" xmlns:w16="http://schemas.microsoft.com/office/word/2018/wordml" xmlns:w16cex="http://schemas.microsoft.com/office/word/2018/wordml/cex" xmlns:oel="http://schemas.microsoft.com/office/2019/extlst">
               <w:pict>
                 <v:group w14:anchorId="53293A81" id="Csoportba foglalás 12" o:spid="_x0000_s1026" style="position:absolute;margin-left:0;margin-top:-8.2pt;width:149.55pt;height:39pt;z-index:-251654144;mso-position-horizontal:center;mso-position-horizontal-relative:margin" coordsize="18995,4953" o:gfxdata="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">
                   <v:oval id="Ellipszis 8" o:spid="_x0000_s1027" style="position:absolute;left:6921;width:4953;height:4953;visibility:visible;mso-wrap-style:square;v-text-anchor:middle" o:gfxdata="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" fillcolor="#764ba2" strokecolor="white [3212]" strokeweight="1pt">
@@ -2405,7 +2229,7 @@
 </file>
 
 <file path=word/footer2.xml><?xml version="1.0" encoding="utf-8"?>
-<w:ftr xmlns:wpc="http://schemas.microsoft.com/office/word/2010/wordprocessingCanvas" xmlns:cx="http://schemas.microsoft.com/office/drawing/2014/chartex" xmlns:cx1="http://schemas.microsoft.com/office/drawing/2015/9/8/chartex" xmlns:cx2="http://schemas.microsoft.com/office/drawing/2015/10/21/chartex" xmlns:cx3="http://schemas.microsoft.com/office/drawing/2016/5/9/chartex" xmlns:cx4="http://schemas.microsoft.com/office/drawing/2016/5/10/chartex" xmlns:cx5="http://schemas.microsoft.com/office/drawing/2016/5/11/chartex" xmlns:cx6="http://schemas.microsoft.com/office/drawing/2016/5/12/chartex" xmlns:cx7="http://schemas.microsoft.com/office/drawing/2016/5/13/chartex" xmlns:cx8="http://schemas.microsoft.com/office/drawing/2016/5/14/chartex" xmlns:mc="http://schemas.openxmlformats.org/markup-compatibility/2006" xmlns:aink="http://schemas.microsoft.com/office/drawing/2016/ink" xmlns:am3d="http://schemas.microsoft.com/office/drawing/2017/model3d" xmlns:o="urn:schemas-microsoft-com:office:office" xmlns:oel="http://schemas.microsoft.com/office/2019/extlst" xmlns:r="http://schemas.openxmlformats.org/officeDocument/2006/relationships" xmlns:m="http://schemas.openxmlformats.org/officeDocument/2006/math" xmlns:v="urn:schemas-microsoft-com:vml" xmlns:wp14="http://schemas.microsoft.com/office/word/2010/wordprocessingDrawing" xmlns:wp="http://schemas.openxmlformats.org/drawingml/2006/wordprocessingDrawing" xmlns:w10="urn:schemas-microsoft-com:office:word" xmlns:w="http://schemas.openxmlformats.org/wordprocessingml/2006/main" xmlns:w14="http://schemas.microsoft.com/office/word/2010/wordml" xmlns:w15="http://schemas.microsoft.com/office/word/2012/wordml" xmlns:w16cex="http://schemas.microsoft.com/office/word/2018/wordml/cex" xmlns:w16cid="http://schemas.microsoft.com/office/word/2016/wordml/cid" xmlns:w16="http://schemas.microsoft.com/office/word/2018/wordml" xmlns:w16du="http://schemas.microsoft.com/office/word/2023/wordml/word16du" xmlns:w16sdtdh="http://schemas.microsoft.com/office/word/2020/wordml/sdtdatahash" xmlns:w16sdtfl="http://schemas.microsoft.com/office/word/2024/wordml/sdtformatlock" xmlns:w16se="http://schemas.microsoft.com/office/word/2015/wordml/symex" xmlns:wpg="http://schemas.microsoft.com/office/word/2010/wordprocessingGroup" xmlns:wpi="http://schemas.microsoft.com/office/word/2010/wordprocessingInk" xmlns:wne="http://schemas.microsoft.com/office/word/2006/wordml" xmlns:wps="http://schemas.microsoft.com/office/word/2010/wordprocessingShape" mc:Ignorable="w14 w15 w16se w16cid w16 w16cex w16sdtdh w16sdtfl w16du wp14">
+<w:ftr xmlns:wpc="http://schemas.microsoft.com/office/word/2010/wordprocessingCanvas" xmlns:cx="http://schemas.microsoft.com/office/drawing/2014/chartex" xmlns:cx1="http://schemas.microsoft.com/office/drawing/2015/9/8/chartex" xmlns:cx2="http://schemas.microsoft.com/office/drawing/2015/10/21/chartex" xmlns:cx3="http://schemas.microsoft.com/office/drawing/2016/5/9/chartex" xmlns:cx4="http://schemas.microsoft.com/office/drawing/2016/5/10/chartex" xmlns:cx5="http://schemas.microsoft.com/office/drawing/2016/5/11/chartex" xmlns:cx6="http://schemas.microsoft.com/office/drawing/2016/5/12/chartex" xmlns:cx7="http://schemas.microsoft.com/office/drawing/2016/5/13/chartex" xmlns:cx8="http://schemas.microsoft.com/office/drawing/2016/5/14/chartex" xmlns:mc="http://schemas.openxmlformats.org/markup-compatibility/2006" xmlns:aink="http://schemas.microsoft.com/office/drawing/2016/ink" xmlns:am3d="http://schemas.microsoft.com/office/drawing/2017/model3d" xmlns:o="urn:schemas-microsoft-com:office:office" xmlns:r="http://schemas.openxmlformats.org/officeDocument/2006/relationships" xmlns:m="http://schemas.openxmlformats.org/officeDocument/2006/math" xmlns:v="urn:schemas-microsoft-com:vml" xmlns:wp14="http://schemas.microsoft.com/office/word/2010/wordprocessingDrawing" xmlns:wp="http://schemas.openxmlformats.org/drawingml/2006/wordprocessingDrawing" xmlns:w10="urn:schemas-microsoft-com:office:word" xmlns:w="http://schemas.openxmlformats.org/wordprocessingml/2006/main" xmlns:w14="http://schemas.microsoft.com/office/word/2010/wordml" xmlns:w15="http://schemas.microsoft.com/office/word/2012/wordml" xmlns:w16cid="http://schemas.microsoft.com/office/word/2016/wordml/cid" xmlns:w16se="http://schemas.microsoft.com/office/word/2015/wordml/symex" xmlns:wpg="http://schemas.microsoft.com/office/word/2010/wordprocessingGroup" xmlns:wpi="http://schemas.microsoft.com/office/word/2010/wordprocessingInk" xmlns:wne="http://schemas.microsoft.com/office/word/2006/wordml" xmlns:wps="http://schemas.microsoft.com/office/word/2010/wordprocessingShape" mc:Ignorable="w14 w15 w16se w16cid wp14">
   <w:p>
     <w:pPr>
       <w:pStyle w:val="llb"/>
@@ -2429,7 +2253,7 @@
 </file>
 
 <file path=word/footnotes.xml><?xml version="1.0" encoding="utf-8"?>
-<w:footnotes xmlns:wpc="http://schemas.microsoft.com/office/word/2010/wordprocessingCanvas" xmlns:cx="http://schemas.microsoft.com/office/drawing/2014/chartex" xmlns:cx1="http://schemas.microsoft.com/office/drawing/2015/9/8/chartex" xmlns:cx2="http://schemas.microsoft.com/office/drawing/2015/10/21/chartex" xmlns:cx3="http://schemas.microsoft.com/office/drawing/2016/5/9/chartex" xmlns:cx4="http://schemas.microsoft.com/office/drawing/2016/5/10/chartex" xmlns:cx5="http://schemas.microsoft.com/office/drawing/2016/5/11/chartex" xmlns:cx6="http://schemas.microsoft.com/office/drawing/2016/5/12/chartex" xmlns:cx7="http://schemas.microsoft.com/office/drawing/2016/5/13/chartex" xmlns:cx8="http://schemas.microsoft.com/office/drawing/2016/5/14/chartex" xmlns:mc="http://schemas.openxmlformats.org/markup-compatibility/2006" xmlns:aink="http://schemas.microsoft.com/office/drawing/2016/ink" xmlns:am3d="http://schemas.microsoft.com/office/drawing/2017/model3d" xmlns:o="urn:schemas-microsoft-com:office:office" xmlns:oel="http://schemas.microsoft.com/office/2019/extlst" xmlns:r="http://schemas.openxmlformats.org/officeDocument/2006/relationships" xmlns:m="http://schemas.openxmlformats.org/officeDocument/2006/math" xmlns:v="urn:schemas-microsoft-com:vml" xmlns:wp14="http://schemas.microsoft.com/office/word/2010/wordprocessingDrawing" xmlns:wp="http://schemas.openxmlformats.org/drawingml/2006/wordprocessingDrawing" xmlns:w10="urn:schemas-microsoft-com:office:word" xmlns:w="http://schemas.openxmlformats.org/wordprocessingml/2006/main" xmlns:w14="http://schemas.microsoft.com/office/word/2010/wordml" xmlns:w15="http://schemas.microsoft.com/office/word/2012/wordml" xmlns:w16cex="http://schemas.microsoft.com/office/word/2018/wordml/cex" xmlns:w16cid="http://schemas.microsoft.com/office/word/2016/wordml/cid" xmlns:w16="http://schemas.microsoft.com/office/word/2018/wordml" xmlns:w16du="http://schemas.microsoft.com/office/word/2023/wordml/word16du" xmlns:w16sdtdh="http://schemas.microsoft.com/office/word/2020/wordml/sdtdatahash" xmlns:w16sdtfl="http://schemas.microsoft.com/office/word/2024/wordml/sdtformatlock" xmlns:w16se="http://schemas.microsoft.com/office/word/2015/wordml/symex" xmlns:wpg="http://schemas.microsoft.com/office/word/2010/wordprocessingGroup" xmlns:wpi="http://schemas.microsoft.com/office/word/2010/wordprocessingInk" xmlns:wne="http://schemas.microsoft.com/office/word/2006/wordml" xmlns:wps="http://schemas.microsoft.com/office/word/2010/wordprocessingShape" mc:Ignorable="w14 w15 w16se w16cid w16 w16cex w16sdtdh w16sdtfl w16du wp14">
+<w:footnotes xmlns:wpc="http://schemas.microsoft.com/office/word/2010/wordprocessingCanvas" xmlns:cx="http://schemas.microsoft.com/office/drawing/2014/chartex" xmlns:cx1="http://schemas.microsoft.com/office/drawing/2015/9/8/chartex" xmlns:cx2="http://schemas.microsoft.com/office/drawing/2015/10/21/chartex" xmlns:cx3="http://schemas.microsoft.com/office/drawing/2016/5/9/chartex" xmlns:cx4="http://schemas.microsoft.com/office/drawing/2016/5/10/chartex" xmlns:cx5="http://schemas.microsoft.com/office/drawing/2016/5/11/chartex" xmlns:cx6="http://schemas.microsoft.com/office/drawing/2016/5/12/chartex" xmlns:cx7="http://schemas.microsoft.com/office/drawing/2016/5/13/chartex" xmlns:cx8="http://schemas.microsoft.com/office/drawing/2016/5/14/chartex" xmlns:mc="http://schemas.openxmlformats.org/markup-compatibility/2006" xmlns:aink="http://schemas.microsoft.com/office/drawing/2016/ink" xmlns:am3d="http://schemas.microsoft.com/office/drawing/2017/model3d" xmlns:o="urn:schemas-microsoft-com:office:office" xmlns:r="http://schemas.openxmlformats.org/officeDocument/2006/relationships" xmlns:m="http://schemas.openxmlformats.org/officeDocument/2006/math" xmlns:v="urn:schemas-microsoft-com:vml" xmlns:wp14="http://schemas.microsoft.com/office/word/2010/wordprocessingDrawing" xmlns:wp="http://schemas.openxmlformats.org/drawingml/2006/wordprocessingDrawing" xmlns:w10="urn:schemas-microsoft-com:office:word" xmlns:w="http://schemas.openxmlformats.org/wordprocessingml/2006/main" xmlns:w14="http://schemas.microsoft.com/office/word/2010/wordml" xmlns:w15="http://schemas.microsoft.com/office/word/2012/wordml" xmlns:w16cid="http://schemas.microsoft.com/office/word/2016/wordml/cid" xmlns:w16se="http://schemas.microsoft.com/office/word/2015/wordml/symex" xmlns:wpg="http://schemas.microsoft.com/office/word/2010/wordprocessingGroup" xmlns:wpi="http://schemas.microsoft.com/office/word/2010/wordprocessingInk" xmlns:wne="http://schemas.microsoft.com/office/word/2006/wordml" xmlns:wps="http://schemas.microsoft.com/office/word/2010/wordprocessingShape" mc:Ignorable="w14 w15 w16se w16cid wp14">
   <w:footnote w:type="separator" w:id="-1">
     <w:p>
       <w:pPr>
@@ -2454,7 +2278,7 @@
 </file>
 
 <file path=word/numbering.xml><?xml version="1.0" encoding="utf-8"?>
-<w:numbering xmlns:wpc="http://schemas.microsoft.com/office/word/2010/wordprocessingCanvas" xmlns:cx="http://schemas.microsoft.com/office/drawing/2014/chartex" xmlns:cx1="http://schemas.microsoft.com/office/drawing/2015/9/8/chartex" xmlns:cx2="http://schemas.microsoft.com/office/drawing/2015/10/21/chartex" xmlns:cx3="http://schemas.microsoft.com/office/drawing/2016/5/9/chartex" xmlns:cx4="http://schemas.microsoft.com/office/drawing/2016/5/10/chartex" xmlns:cx5="http://schemas.microsoft.com/office/drawing/2016/5/11/chartex" xmlns:cx6="http://schemas.microsoft.com/office/drawing/2016/5/12/chartex" xmlns:cx7="http://schemas.microsoft.com/office/drawing/2016/5/13/chartex" xmlns:cx8="http://schemas.microsoft.com/office/drawing/2016/5/14/chartex" xmlns:mc="http://schemas.openxmlformats.org/markup-compatibility/2006" xmlns:aink="http://schemas.microsoft.com/office/drawing/2016/ink" xmlns:am3d="http://schemas.microsoft.com/office/drawing/2017/model3d" xmlns:o="urn:schemas-microsoft-com:office:office" xmlns:oel="http://schemas.microsoft.com/office/2019/extlst" xmlns:r="http://schemas.openxmlformats.org/officeDocument/2006/relationships" xmlns:m="http://schemas.openxmlformats.org/officeDocument/2006/math" xmlns:v="urn:schemas-microsoft-com:vml" xmlns:wp14="http://schemas.microsoft.com/office/word/2010/wordprocessingDrawing" xmlns:wp="http://schemas.openxmlformats.org/drawingml/2006/wordprocessingDrawing" xmlns:w10="urn:schemas-microsoft-com:office:word" xmlns:w="http://schemas.openxmlformats.org/wordprocessingml/2006/main" xmlns:w14="http://schemas.microsoft.com/office/word/2010/wordml" xmlns:w15="http://schemas.microsoft.com/office/word/2012/wordml" xmlns:w16cex="http://schemas.microsoft.com/office/word/2018/wordml/cex" xmlns:w16cid="http://schemas.microsoft.com/office/word/2016/wordml/cid" xmlns:w16="http://schemas.microsoft.com/office/word/2018/wordml" xmlns:w16du="http://schemas.microsoft.com/office/word/2023/wordml/word16du" xmlns:w16sdtdh="http://schemas.microsoft.com/office/word/2020/wordml/sdtdatahash" xmlns:w16sdtfl="http://schemas.microsoft.com/office/word/2024/wordml/sdtformatlock" xmlns:w16se="http://schemas.microsoft.com/office/word/2015/wordml/symex" xmlns:wpg="http://schemas.microsoft.com/office/word/2010/wordprocessingGroup" xmlns:wpi="http://schemas.microsoft.com/office/word/2010/wordprocessingInk" xmlns:wne="http://schemas.microsoft.com/office/word/2006/wordml" xmlns:wps="http://schemas.microsoft.com/office/word/2010/wordprocessingShape" mc:Ignorable="w14 w15 w16se w16cid w16 w16cex w16sdtdh w16sdtfl w16du wp14">
+<w:numbering xmlns:wpc="http://schemas.microsoft.com/office/word/2010/wordprocessingCanvas" xmlns:cx="http://schemas.microsoft.com/office/drawing/2014/chartex" xmlns:cx1="http://schemas.microsoft.com/office/drawing/2015/9/8/chartex" xmlns:cx2="http://schemas.microsoft.com/office/drawing/2015/10/21/chartex" xmlns:cx3="http://schemas.microsoft.com/office/drawing/2016/5/9/chartex" xmlns:cx4="http://schemas.microsoft.com/office/drawing/2016/5/10/chartex" xmlns:cx5="http://schemas.microsoft.com/office/drawing/2016/5/11/chartex" xmlns:cx6="http://schemas.microsoft.com/office/drawing/2016/5/12/chartex" xmlns:cx7="http://schemas.microsoft.com/office/drawing/2016/5/13/chartex" xmlns:cx8="http://schemas.microsoft.com/office/drawing/2016/5/14/chartex" xmlns:mc="http://schemas.openxmlformats.org/markup-compatibility/2006" xmlns:aink="http://schemas.microsoft.com/office/drawing/2016/ink" xmlns:am3d="http://schemas.microsoft.com/office/drawing/2017/model3d" xmlns:o="urn:schemas-microsoft-com:office:office" xmlns:r="http://schemas.openxmlformats.org/officeDocument/2006/relationships" xmlns:m="http://schemas.openxmlformats.org/officeDocument/2006/math" xmlns:v="urn:schemas-microsoft-com:vml" xmlns:wp14="http://schemas.microsoft.com/office/word/2010/wordprocessingDrawing" xmlns:wp="http://schemas.openxmlformats.org/drawingml/2006/wordprocessingDrawing" xmlns:w10="urn:schemas-microsoft-com:office:word" xmlns:w="http://schemas.openxmlformats.org/wordprocessingml/2006/main" xmlns:w14="http://schemas.microsoft.com/office/word/2010/wordml" xmlns:w15="http://schemas.microsoft.com/office/word/2012/wordml" xmlns:w16cid="http://schemas.microsoft.com/office/word/2016/wordml/cid" xmlns:w16se="http://schemas.microsoft.com/office/word/2015/wordml/symex" xmlns:wpg="http://schemas.microsoft.com/office/word/2010/wordprocessingGroup" xmlns:wpi="http://schemas.microsoft.com/office/word/2010/wordprocessingInk" xmlns:wne="http://schemas.microsoft.com/office/word/2006/wordml" xmlns:wps="http://schemas.microsoft.com/office/word/2010/wordprocessingShape" mc:Ignorable="w14 w15 w16se w16cid wp14">
   <w:abstractNum w:abstractNumId="0" w15:restartNumberingAfterBreak="0">
     <w:nsid w:val="159F1FBD"/>
     <w:multiLevelType w:val="hybridMultilevel"/>
@@ -3359,35 +3183,35 @@
       </w:rPr>
     </w:lvl>
   </w:abstractNum>
-  <w:num w:numId="1" w16cid:durableId="1174761035">
+  <w:num w:numId="1">
     <w:abstractNumId w:val="5"/>
   </w:num>
-  <w:num w:numId="2" w16cid:durableId="522327313">
+  <w:num w:numId="2">
     <w:abstractNumId w:val="3"/>
   </w:num>
-  <w:num w:numId="3" w16cid:durableId="1596480155">
+  <w:num w:numId="3">
     <w:abstractNumId w:val="2"/>
   </w:num>
-  <w:num w:numId="4" w16cid:durableId="541866446">
+  <w:num w:numId="4">
     <w:abstractNumId w:val="0"/>
   </w:num>
-  <w:num w:numId="5" w16cid:durableId="1101027169">
+  <w:num w:numId="5">
     <w:abstractNumId w:val="4"/>
   </w:num>
-  <w:num w:numId="6" w16cid:durableId="1844855187">
+  <w:num w:numId="6">
     <w:abstractNumId w:val="6"/>
   </w:num>
-  <w:num w:numId="7" w16cid:durableId="878198592">
+  <w:num w:numId="7">
     <w:abstractNumId w:val="1"/>
   </w:num>
-  <w:num w:numId="8" w16cid:durableId="1652367988">
+  <w:num w:numId="8">
     <w:abstractNumId w:val="7"/>
   </w:num>
 </w:numbering>
 </file>
 
 <file path=word/styles.xml><?xml version="1.0" encoding="utf-8"?>
-<w:styles xmlns:mc="http://schemas.openxmlformats.org/markup-compatibility/2006" xmlns:r="http://schemas.openxmlformats.org/officeDocument/2006/relationships" xmlns:w="http://schemas.openxmlformats.org/wordprocessingml/2006/main" xmlns:w14="http://schemas.microsoft.com/office/word/2010/wordml" xmlns:w15="http://schemas.microsoft.com/office/word/2012/wordml" xmlns:w16cex="http://schemas.microsoft.com/office/word/2018/wordml/cex" xmlns:w16cid="http://schemas.microsoft.com/office/word/2016/wordml/cid" xmlns:w16="http://schemas.microsoft.com/office/word/2018/wordml" xmlns:w16du="http://schemas.microsoft.com/office/word/2023/wordml/word16du" xmlns:w16sdtdh="http://schemas.microsoft.com/office/word/2020/wordml/sdtdatahash" xmlns:w16sdtfl="http://schemas.microsoft.com/office/word/2024/wordml/sdtformatlock" xmlns:w16se="http://schemas.microsoft.com/office/word/2015/wordml/symex" mc:Ignorable="w14 w15 w16se w16cid w16 w16cex w16sdtdh w16sdtfl w16du">
+<w:styles xmlns:mc="http://schemas.openxmlformats.org/markup-compatibility/2006" xmlns:r="http://schemas.openxmlformats.org/officeDocument/2006/relationships" xmlns:w="http://schemas.openxmlformats.org/wordprocessingml/2006/main" xmlns:w14="http://schemas.microsoft.com/office/word/2010/wordml" xmlns:w15="http://schemas.microsoft.com/office/word/2012/wordml" xmlns:w16cid="http://schemas.microsoft.com/office/word/2016/wordml/cid" xmlns:w16se="http://schemas.microsoft.com/office/word/2015/wordml/symex" mc:Ignorable="w14 w15 w16se w16cid">
   <w:docDefaults>
     <w:rPrDefault>
       <w:rPr>
@@ -3403,7 +3227,7 @@
       </w:pPr>
     </w:pPrDefault>
   </w:docDefaults>
-  <w:latentStyles w:defLockedState="0" w:defUIPriority="99" w:defSemiHidden="0" w:defUnhideWhenUsed="0" w:defQFormat="0" w:count="376">
+  <w:latentStyles w:defLockedState="0" w:defUIPriority="99" w:defSemiHidden="0" w:defUnhideWhenUsed="0" w:defQFormat="0" w:count="375">
     <w:lsdException w:name="Normal" w:uiPriority="0" w:qFormat="1"/>
     <w:lsdException w:name="heading 1" w:uiPriority="9" w:qFormat="1"/>
     <w:lsdException w:name="heading 2" w:semiHidden="1" w:uiPriority="9" w:unhideWhenUsed="1" w:qFormat="1"/>
@@ -3779,7 +3603,6 @@
     <w:lsdException w:name="Smart Hyperlink" w:semiHidden="1" w:unhideWhenUsed="1"/>
     <w:lsdException w:name="Hashtag" w:semiHidden="1" w:unhideWhenUsed="1"/>
     <w:lsdException w:name="Unresolved Mention" w:semiHidden="1" w:unhideWhenUsed="1"/>
-    <w:lsdException w:name="Smart Link" w:semiHidden="1" w:unhideWhenUsed="1"/>
   </w:latentStyles>
   <w:style w:type="paragraph" w:default="1" w:styleId="Norml">
     <w:name w:val="Normal"/>
@@ -4038,10 +3861,10 @@
     <w:autoRedefine/>
     <w:uiPriority w:val="39"/>
     <w:unhideWhenUsed/>
-    <w:rsid w:val="00017908"/>
+    <w:rsid w:val="00EC3A66"/>
     <w:pPr>
       <w:spacing w:before="100" w:after="100"/>
-      <w:ind w:left="567"/>
+      <w:ind w:left="851"/>
     </w:pPr>
     <w:rPr>
       <w:rFonts w:ascii="Arial" w:hAnsi="Arial"/>
@@ -4056,10 +3879,10 @@
     <w:autoRedefine/>
     <w:uiPriority w:val="39"/>
     <w:unhideWhenUsed/>
-    <w:rsid w:val="0015629E"/>
+    <w:rsid w:val="00EC3A66"/>
     <w:pPr>
       <w:spacing w:before="100" w:after="100"/>
-      <w:ind w:left="851"/>
+      <w:ind w:left="1134"/>
     </w:pPr>
     <w:rPr>
       <w:rFonts w:ascii="Arial" w:hAnsi="Arial"/>
@@ -4463,7 +4286,7 @@
 </file>
 
 <file path=customXml/itemProps1.xml><?xml version="1.0" encoding="utf-8"?>
-<ds:datastoreItem xmlns:ds="http://schemas.openxmlformats.org/officeDocument/2006/customXml" ds:itemID="{D2F3A964-5C11-4B61-91C6-C7C6AA4655EF}">
+<ds:datastoreItem xmlns:ds="http://schemas.openxmlformats.org/officeDocument/2006/customXml" ds:itemID="{75D854CF-3C48-4293-949D-726C7B044B46}">
   <ds:schemaRefs>
     <ds:schemaRef ds:uri="http://schemas.openxmlformats.org/officeDocument/2006/bibliography"/>
   </ds:schemaRefs>

</xml_diff>